<commit_message>
cambiados mutuo y pagare
</commit_message>
<xml_diff>
--- a/templates/template_mutuo.docx
+++ b/templates/template_mutuo.docx
@@ -43,7 +43,135 @@
           <w:sz w:val="20"/>
           <w:lang w:val="es-US"/>
         </w:rPr>
-        <w:t>En la ciudad de Córdoba, Córdoba, el Señor Santa Cruz Cristian, D.N.I:  22645582 con domicilio en calle Caseros 344 piso 5 oficina 46, en adelante denominado el “MUTUANTE /ACREEDOR" por una parte; y por la otra {nombre_apellido} DNI {dni}, con domicilio en {domicilio}, provincia de Córdoba y número de teléfono {telefono}; en adelante denominada la “MUTUARIO/DEUDOR"; celebran el presente contrato sujeto a las siguientes cláusulas y condiciones: </w:t>
+        <w:t>En la ciudad de Córdoba, Córdoba, el Señor</w:t>
+      </w:r>
+      <w:r>
+        <w:rPr>
+          <w:rFonts w:ascii="Times" w:hAnsi="Times" w:cs="Times"/>
+          <w:sz w:val="20"/>
+          <w:lang w:val="es-US"/>
+        </w:rPr>
+        <w:t xml:space="preserve"> </w:t>
+      </w:r>
+      <w:proofErr w:type="spellStart"/>
+      <w:r>
+        <w:rPr>
+          <w:rFonts w:ascii="Times" w:hAnsi="Times" w:cs="Times"/>
+          <w:sz w:val="20"/>
+          <w:lang w:val="es-US"/>
+        </w:rPr>
+        <w:t>Martinez</w:t>
+      </w:r>
+      <w:proofErr w:type="spellEnd"/>
+      <w:r>
+        <w:rPr>
+          <w:rFonts w:ascii="Times" w:hAnsi="Times" w:cs="Times"/>
+          <w:sz w:val="20"/>
+          <w:lang w:val="es-US"/>
+        </w:rPr>
+        <w:t xml:space="preserve"> Federico </w:t>
+      </w:r>
+      <w:proofErr w:type="spellStart"/>
+      <w:r>
+        <w:rPr>
+          <w:rFonts w:ascii="Times" w:hAnsi="Times" w:cs="Times"/>
+          <w:sz w:val="20"/>
+          <w:lang w:val="es-US"/>
+        </w:rPr>
+        <w:t>Jose</w:t>
+      </w:r>
+      <w:proofErr w:type="spellEnd"/>
+      <w:r>
+        <w:rPr>
+          <w:rFonts w:ascii="Times" w:hAnsi="Times" w:cs="Times"/>
+          <w:sz w:val="20"/>
+          <w:lang w:val="es-US"/>
+        </w:rPr>
+        <w:t>, D.N.I: </w:t>
+      </w:r>
+      <w:proofErr w:type="gramStart"/>
+      <w:r>
+        <w:rPr>
+          <w:rFonts w:ascii="Times" w:hAnsi="Times" w:cs="Times"/>
+          <w:sz w:val="20"/>
+          <w:lang w:val="es-US"/>
+        </w:rPr>
+        <w:t>33.976.265</w:t>
+      </w:r>
+      <w:r>
+        <w:rPr>
+          <w:rFonts w:ascii="Times" w:hAnsi="Times" w:cs="Times"/>
+          <w:sz w:val="20"/>
+          <w:lang w:val="es-US"/>
+        </w:rPr>
+        <w:t xml:space="preserve"> </w:t>
+      </w:r>
+      <w:r>
+        <w:rPr>
+          <w:rFonts w:ascii="Times" w:hAnsi="Times" w:cs="Times"/>
+          <w:sz w:val="20"/>
+          <w:lang w:val="es-US"/>
+        </w:rPr>
+        <w:t xml:space="preserve"> con</w:t>
+      </w:r>
+      <w:proofErr w:type="gramEnd"/>
+      <w:r>
+        <w:rPr>
+          <w:rFonts w:ascii="Times" w:hAnsi="Times" w:cs="Times"/>
+          <w:sz w:val="20"/>
+          <w:lang w:val="es-US"/>
+        </w:rPr>
+        <w:t xml:space="preserve"> domicilio en calle</w:t>
+      </w:r>
+      <w:r>
+        <w:rPr>
+          <w:rFonts w:ascii="Times" w:hAnsi="Times" w:cs="Times"/>
+          <w:sz w:val="20"/>
+          <w:lang w:val="es-US"/>
+        </w:rPr>
+        <w:t xml:space="preserve"> </w:t>
+      </w:r>
+      <w:r>
+        <w:rPr>
+          <w:rFonts w:ascii="Times" w:hAnsi="Times" w:cs="Times"/>
+          <w:sz w:val="20"/>
+          <w:lang w:val="es-US"/>
+        </w:rPr>
+        <w:t xml:space="preserve">Gregorio </w:t>
+      </w:r>
+      <w:proofErr w:type="spellStart"/>
+      <w:r>
+        <w:rPr>
+          <w:rFonts w:ascii="Times" w:hAnsi="Times" w:cs="Times"/>
+          <w:sz w:val="20"/>
+          <w:lang w:val="es-US"/>
+        </w:rPr>
+        <w:t>Velez</w:t>
+      </w:r>
+      <w:proofErr w:type="spellEnd"/>
+      <w:r>
+        <w:rPr>
+          <w:rFonts w:ascii="Times" w:hAnsi="Times" w:cs="Times"/>
+          <w:sz w:val="20"/>
+          <w:lang w:val="es-US"/>
+        </w:rPr>
+        <w:t xml:space="preserve"> 4365</w:t>
+      </w:r>
+      <w:r>
+        <w:rPr>
+          <w:rFonts w:ascii="Times" w:hAnsi="Times" w:cs="Times"/>
+          <w:sz w:val="20"/>
+          <w:lang w:val="es-US"/>
+        </w:rPr>
+        <w:t xml:space="preserve"> Barrio: Cerro de las rosas </w:t>
+      </w:r>
+      <w:r>
+        <w:rPr>
+          <w:rFonts w:ascii="Times" w:hAnsi="Times" w:cs="Times"/>
+          <w:sz w:val="20"/>
+          <w:lang w:val="es-US"/>
+        </w:rPr>
+        <w:t>, en adelante denominado el “MUTUANTE /ACREEDOR" por una parte; y por la otra {nombre_apellido} DNI {dni}, con domicilio en {domicilio}, provincia de Córdoba y número de teléfono {telefono}; en adelante denominada la “MUTUARIO/DEUDOR"; celebran el presente contrato sujeto a las siguientes cláusulas y condiciones: </w:t>
       </w:r>
     </w:p>
     <w:p>
@@ -455,25 +583,87 @@
         </w:rPr>
         <w:t xml:space="preserve">, </w:t>
       </w:r>
-      <w:proofErr w:type="gramStart"/>
-      <w:r>
-        <w:rPr>
-          <w:rFonts w:ascii="Times" w:hAnsi="Times" w:cs="Times"/>
-          <w:sz w:val="20"/>
-          <w:highlight w:val="yellow"/>
-          <w:lang w:val="es-US"/>
-        </w:rPr>
-        <w:t>a  día</w:t>
-      </w:r>
-      <w:proofErr w:type="gramEnd"/>
-      <w:r>
-        <w:rPr>
-          <w:rFonts w:ascii="Times" w:hAnsi="Times" w:cs="Times"/>
-          <w:sz w:val="20"/>
-          <w:highlight w:val="yellow"/>
-          <w:lang w:val="es-US"/>
-        </w:rPr>
-        <w:t xml:space="preserve"> del mes de  del año 2025.-</w:t>
+      <w:r>
+        <w:rPr>
+          <w:rFonts w:ascii="Times" w:hAnsi="Times" w:cs="Times"/>
+          <w:sz w:val="20"/>
+          <w:lang w:val="es-US"/>
+        </w:rPr>
+        <w:t>a</w:t>
+      </w:r>
+      <w:r>
+        <w:rPr>
+          <w:rFonts w:ascii="Times" w:hAnsi="Times" w:cs="Times"/>
+          <w:sz w:val="20"/>
+          <w:lang w:val="es-US"/>
+        </w:rPr>
+        <w:t xml:space="preserve">l </w:t>
+      </w:r>
+      <w:proofErr w:type="spellStart"/>
+      <w:r>
+        <w:rPr>
+          <w:rFonts w:ascii="Times" w:hAnsi="Times" w:cs="Times"/>
+          <w:sz w:val="20"/>
+          <w:lang w:val="es-US"/>
+        </w:rPr>
+        <w:t>dia</w:t>
+      </w:r>
+      <w:proofErr w:type="spellEnd"/>
+      <w:r>
+        <w:rPr>
+          <w:rFonts w:ascii="Times" w:hAnsi="Times" w:cs="Times"/>
+          <w:sz w:val="20"/>
+          <w:lang w:val="es-US"/>
+        </w:rPr>
+        <w:t xml:space="preserve">  </w:t>
+      </w:r>
+      <w:r>
+        <w:rPr>
+          <w:rFonts w:ascii="Times" w:hAnsi="Times" w:cs="Times"/>
+          <w:sz w:val="20"/>
+          <w:lang w:val="es-US"/>
+        </w:rPr>
+        <w:t xml:space="preserve">     </w:t>
+      </w:r>
+      <w:r>
+        <w:rPr>
+          <w:rFonts w:ascii="Times" w:hAnsi="Times" w:cs="Times"/>
+          <w:sz w:val="20"/>
+          <w:lang w:val="es-US"/>
+        </w:rPr>
+        <w:t xml:space="preserve"> </w:t>
+      </w:r>
+      <w:r>
+        <w:rPr>
+          <w:rFonts w:ascii="Times" w:hAnsi="Times" w:cs="Times"/>
+          <w:sz w:val="20"/>
+          <w:lang w:val="es-US"/>
+        </w:rPr>
+        <w:t xml:space="preserve"> del </w:t>
+      </w:r>
+      <w:r>
+        <w:rPr>
+          <w:rFonts w:ascii="Times" w:hAnsi="Times" w:cs="Times"/>
+          <w:sz w:val="20"/>
+          <w:lang w:val="es-US"/>
+        </w:rPr>
+        <w:t xml:space="preserve">mes de </w:t>
+      </w:r>
+      <w:r>
+        <w:rPr>
+          <w:rFonts w:ascii="Times" w:hAnsi="Times" w:cs="Times"/>
+          <w:sz w:val="20"/>
+          <w:lang w:val="es-US"/>
+        </w:rPr>
+        <w:t xml:space="preserve">                       </w:t>
+      </w:r>
+      <w:r>
+        <w:rPr>
+          <w:rFonts w:ascii="Times" w:hAnsi="Times" w:cs="Times"/>
+          <w:sz w:val="20"/>
+          <w:lang w:val="es-US"/>
+        </w:rPr>
+        <w:t xml:space="preserve"> del año 2025.-</w:t>
       </w:r>
       <w:r>
         <w:rPr>
@@ -563,6 +753,13 @@
         </w:rPr>
         <w:tab/>
         <w:t>MUTUTARIO</w:t>
+      </w:r>
+      <w:r>
+        <w:rPr>
+          <w:rFonts w:ascii="Times" w:hAnsi="Times" w:cs="Times"/>
+          <w:sz w:val="24"/>
+        </w:rPr>
+        <w:t xml:space="preserve"> </w:t>
       </w:r>
       <w:r>
         <w:rPr>

</xml_diff>

<commit_message>
changed mutuo y pagare
</commit_message>
<xml_diff>
--- a/templates/template_mutuo.docx
+++ b/templates/template_mutuo.docx
@@ -37,7 +37,7 @@
           <w:sz w:val="20"/>
           <w:sz-cs w:val="20"/>
         </w:rPr>
-        <w:t xml:space="preserve">En la ciudad de Córdoba, Córdoba, el Señor Santa Cruz Cristian, D.N.I:  22645582 con domicilio en calle Caseros 344 piso 5 oficina 46, en adelante denominado el “MUTUANTE /ACREEDOR" por una parte; y por la otra {nombre_apellido} DNI {dni}, con domicilio en {domicilio}, provincia de Córdoba y número de teléfono {telefono}; en adelante denominada la “MUTUARIO/DEUDOR"; celebran el presente contrato sujeto a las siguientes cláusulas y condiciones: </w:t>
+        <w:t xml:space="preserve">En la ciudad de Córdoba, Córdoba, el Señor Martínez Federico José, D.N.I: 33976265 con domicilio en calle Carril de los chilenos 1267, en adelante denominado el “MUTUANTE /ACREEDOR" por una parte; y por la otra {nombre_apellido} DNI {dni}, con domicilio en {domicilio}, provincia de Córdoba y número de teléfono {telefono}; en adelante denominada la “MUTUARIO/DEUDOR"; celebran el presente contrato sujeto a las siguientes cláusulas y condiciones: </w:t>
       </w:r>
     </w:p>
     <w:p>
@@ -109,7 +109,7 @@
           <w:sz w:val="20"/>
           <w:sz-cs w:val="20"/>
         </w:rPr>
-        <w:t xml:space="preserve">: Las cuotas vencen el 10 de cada mes. La primera vencerá el {fecha_primera_cuota}.  El lugar de pago de dichas cuotas será en la calle Caseros 344 Piso 5 Oficina 46 de la ciudad de Córdoba.  </w:t>
+        <w:t xml:space="preserve">: Las cuotas vencen el 5 de cada mes. La primera vencerá el {fecha_primera_cuota}.  El lugar de pago de dichas cuotas será en la calle Esquiú 68 Piso 4 Oficina A, de la ciudad de Córdoba.  </w:t>
       </w:r>
     </w:p>
     <w:p>
@@ -133,7 +133,7 @@
           <w:sz w:val="20"/>
           <w:sz-cs w:val="20"/>
         </w:rPr>
-        <w:t xml:space="preserve"> La mora es automática. Pasado el día 10 de cada mes, la parte deudora deberá abonar aparte del monto correspondiente, una multa diaria equivalente al medio por ciento (0.5%) del valor adeudado a contar desde el día uno.  En caso de incumplimiento de dos cuotas consecutivas, esto dará derecho al Acreedor a considerar resuelto el contrato, pudiendo reclamar la devolución de la totalidad de las cuotas pendientes, más lo resultante de la multa establecida, como si fueran de carácter vencido. El presente instrumento tiene carácter de título ejecutivo.  </w:t>
+        <w:t xml:space="preserve"> La mora es automática. Pasado el día 5 de cada mes, la parte deudora deberá abonar aparte del monto correspondiente, una multa diaria equivalente al medio por ciento (0.5%) del valor adeudado a contar desde el día uno.  En caso de incumplimiento de dos cuotas consecutivas, esto dará derecho al Acreedor a considerar resuelto el contrato, pudiendo reclamar la devolución de la totalidad de las cuotas pendientes, más lo resultante de la multa establecida, como si fueran de carácter vencido. El presente instrumento tiene carácter de título ejecutivo.  </w:t>
       </w:r>
     </w:p>
     <w:p>
@@ -275,7 +275,7 @@
           <w:sz w:val="20"/>
           <w:sz-cs w:val="20"/>
         </w:rPr>
-        <w:t xml:space="preserve">Leído y de conformidad, se firman dos ejemplares de un mismo tenor y a un solo efecto, en la localidad de Córdoba Capital, a  día del mes de  del año 2026.- </w:t>
+        <w:t xml:space="preserve">Leído y de conformidad, se firman dos ejemplares de un mismo tenor y a un solo efecto, en la localidad de Córdoba Capital, a día {dia_mutuo} del mes de {mes_letra_mutuo} del año 2026.- </w:t>
       </w:r>
     </w:p>
     <w:p>
@@ -336,7 +336,7 @@
         <w:tab/>
         <w:t xml:space="preserve"/>
         <w:tab/>
-        <w:t xml:space="preserve">MUTUTARIO</w:t>
+        <w:t xml:space="preserve">MUTUARIO</w:t>
         <w:tab/>
         <w:t xml:space="preserve"/>
         <w:tab/>

</xml_diff>